<commit_message>
fix: update MD reviewer name to Kim Youngman
</commit_message>
<xml_diff>
--- a/deliverables/hyundai-deptstore-ai-inventory-cost-strategy-reference.docx
+++ b/deliverables/hyundai-deptstore-ai-inventory-cost-strategy-reference.docx
@@ -826,6 +826,166 @@
         <w:t>Q_base_daily=기준 일판매량, ε=가격 탄력성, d=할인율, f_aging(t)=남은 기간 보정값, γ_channel=판매 채널 보정값입니다.</w:t>
       </w:r>
     </w:p>
+    <w:p>
+      <w:r>
+        <w:rPr>
+          <w:rFonts w:ascii="Apple SD Gothic Neo" w:hAnsi="Apple SD Gothic Neo" w:eastAsia="Apple SD Gothic Neo" w:cs="Apple SD Gothic Neo"/>
+        </w:rPr>
+        <w:br w:type="page"/>
+      </w:r>
+    </w:p>
+    <w:p>
+      <w:pPr>
+        <w:pStyle w:val="Heading1"/>
+      </w:pPr>
+      <w:r>
+        <w:rPr>
+          <w:rFonts w:ascii="Apple SD Gothic Neo" w:hAnsi="Apple SD Gothic Neo" w:eastAsia="Apple SD Gothic Neo" w:cs="Apple SD Gothic Neo"/>
+          <w:color w:val="005F4B"/>
+        </w:rPr>
+        <w:t>5. 현대백화점 단독 범위와 P1/P2 운영 경계</w:t>
+      </w:r>
+    </w:p>
+    <w:p>
+      <w:r>
+        <w:rPr>
+          <w:rFonts w:ascii="Apple SD Gothic Neo" w:hAnsi="Apple SD Gothic Neo" w:eastAsia="Apple SD Gothic Neo" w:cs="Apple SD Gothic Neo"/>
+        </w:rPr>
+        <w:t>이 프로젝트는 현대백화점 외 계열사를 포함하지 않습니다. 1차 검증은 더현대 서울 직매입 재고와 의류·신발 등 1~2개 상품군에 집중하고, 점포 간 비교·재고 이동은 후순위(P2)로 둡니다.</w:t>
+      </w:r>
+    </w:p>
+    <w:p>
+      <w:pPr>
+        <w:pStyle w:val="Heading2"/>
+      </w:pPr>
+      <w:r>
+        <w:rPr>
+          <w:rFonts w:ascii="Apple SD Gothic Neo" w:hAnsi="Apple SD Gothic Neo" w:eastAsia="Apple SD Gothic Neo" w:cs="Apple SD Gothic Neo"/>
+        </w:rPr>
+        <w:t>■ P0/P1 — 먼저 검증할 기능</w:t>
+      </w:r>
+    </w:p>
+    <w:p>
+      <w:pPr>
+        <w:pStyle w:val="ListBullet"/>
+      </w:pPr>
+      <w:r>
+        <w:rPr>
+          <w:rFonts w:ascii="Apple SD Gothic Neo" w:hAnsi="Apple SD Gothic Neo" w:eastAsia="Apple SD Gothic Neo" w:cs="Apple SD Gothic Neo"/>
+        </w:rPr>
+        <w:t>직매입 위험재고 탐지: 판매속도·현재고·보관일수·시즌/처리기한·사이즈 분포</w:t>
+      </w:r>
+    </w:p>
+    <w:p>
+      <w:pPr>
+        <w:pStyle w:val="ListBullet"/>
+      </w:pPr>
+      <w:r>
+        <w:rPr>
+          <w:rFonts w:ascii="Apple SD Gothic Neo" w:hAnsi="Apple SD Gothic Neo" w:eastAsia="Apple SD Gothic Neo" w:cs="Apple SD Gothic Neo"/>
+        </w:rPr>
+        <w:t>할인·타임세일·아울렛·기부·폐기 전략 비교</w:t>
+      </w:r>
+    </w:p>
+    <w:p>
+      <w:pPr>
+        <w:pStyle w:val="ListBullet"/>
+      </w:pPr>
+      <w:r>
+        <w:rPr>
+          <w:rFonts w:ascii="Apple SD Gothic Neo" w:hAnsi="Apple SD Gothic Neo" w:eastAsia="Apple SD Gothic Neo" w:cs="Apple SD Gothic Neo"/>
+        </w:rPr>
+        <w:t>순마진 극대화·빠른 소진·최대 매출 시나리오와 최대 3개 후보</w:t>
+      </w:r>
+    </w:p>
+    <w:p>
+      <w:pPr>
+        <w:pStyle w:val="ListBullet"/>
+      </w:pPr>
+      <w:r>
+        <w:rPr>
+          <w:rFonts w:ascii="Apple SD Gothic Neo" w:hAnsi="Apple SD Gothic Neo" w:eastAsia="Apple SD Gothic Neo" w:cs="Apple SD Gothic Neo"/>
+        </w:rPr>
+        <w:t>할인율·적용수량·기간·쿠폰·포인트·배송비 조정 시 즉시 재계산</w:t>
+      </w:r>
+    </w:p>
+    <w:p>
+      <w:pPr>
+        <w:pStyle w:val="ListBullet"/>
+      </w:pPr>
+      <w:r>
+        <w:rPr>
+          <w:rFonts w:ascii="Apple SD Gothic Neo" w:hAnsi="Apple SD Gothic Neo" w:eastAsia="Apple SD Gothic Neo" w:cs="Apple SD Gothic Neo"/>
+        </w:rPr>
+        <w:t>책임 MD 승인, 승인 후 변경 재승인, 실행 결과와 예측 오차 회수</w:t>
+      </w:r>
+    </w:p>
+    <w:p>
+      <w:pPr>
+        <w:pStyle w:val="ListBullet"/>
+      </w:pPr>
+      <w:r>
+        <w:rPr>
+          <w:rFonts w:ascii="Apple SD Gothic Neo" w:hAnsi="Apple SD Gothic Neo" w:eastAsia="Apple SD Gothic Neo" w:cs="Apple SD Gothic Neo"/>
+        </w:rPr>
+        <w:t>Microsoft Teams는 승인된 실행 내용을 전달하는 알림 채널로만 사용</w:t>
+      </w:r>
+    </w:p>
+    <w:p>
+      <w:pPr>
+        <w:pStyle w:val="Heading2"/>
+      </w:pPr>
+      <w:r>
+        <w:rPr>
+          <w:rFonts w:ascii="Apple SD Gothic Neo" w:hAnsi="Apple SD Gothic Neo" w:eastAsia="Apple SD Gothic Neo" w:cs="Apple SD Gothic Neo"/>
+        </w:rPr>
+        <w:t>■ P2 — 검증 후 추가할 기능</w:t>
+      </w:r>
+    </w:p>
+    <w:p>
+      <w:pPr>
+        <w:pStyle w:val="ListBullet"/>
+      </w:pPr>
+      <w:r>
+        <w:rPr>
+          <w:rFonts w:ascii="Apple SD Gothic Neo" w:hAnsi="Apple SD Gothic Neo" w:eastAsia="Apple SD Gothic Neo" w:cs="Apple SD Gothic Neo"/>
+        </w:rPr>
+        <w:t>다른 현대백화점 점포와 동일 상품 비교</w:t>
+      </w:r>
+    </w:p>
+    <w:p>
+      <w:pPr>
+        <w:pStyle w:val="ListBullet"/>
+      </w:pPr>
+      <w:r>
+        <w:rPr>
+          <w:rFonts w:ascii="Apple SD Gothic Neo" w:hAnsi="Apple SD Gothic Neo" w:eastAsia="Apple SD Gothic Neo" w:cs="Apple SD Gothic Neo"/>
+        </w:rPr>
+        <w:t>점포 간 재고 이동 추천(이동수량·이동비용·수신 용량·이동 후 판매속도)</w:t>
+      </w:r>
+    </w:p>
+    <w:p>
+      <w:pPr>
+        <w:pStyle w:val="ListBullet"/>
+      </w:pPr>
+      <w:r>
+        <w:rPr>
+          <w:rFonts w:ascii="Apple SD Gothic Neo" w:hAnsi="Apple SD Gothic Neo" w:eastAsia="Apple SD Gothic Neo" w:cs="Apple SD Gothic Neo"/>
+        </w:rPr>
+        <w:t>식품·가구·가전 등 추가 상품군과 특약·임대 등 계약 형태 확장</w:t>
+      </w:r>
+    </w:p>
+    <w:p>
+      <w:pPr>
+        <w:pStyle w:val="ListBullet"/>
+      </w:pPr>
+      <w:r>
+        <w:rPr>
+          <w:rFonts w:ascii="Apple SD Gothic Neo" w:hAnsi="Apple SD Gothic Neo" w:eastAsia="Apple SD Gothic Neo" w:cs="Apple SD Gothic Neo"/>
+        </w:rPr>
+        <w:t>점포·채널 공동 프로모션</w:t>
+      </w:r>
+    </w:p>
     <w:sectPr>
       <w:pgSz w:w="12240" w:h="15840"/>
       <w:pgMar w:top="1440" w:right="1440" w:bottom="1440" w:left="1440" w:header="720" w:footer="720" w:gutter="0"/>

</xml_diff>